<commit_message>
docs: refresh Activity 2 Word report
</commit_message>
<xml_diff>
--- a/docs/Actividad_2_Estudio_de_Caso.docx
+++ b/docs/Actividad_2_Estudio_de_Caso.docx
@@ -873,7 +873,7 @@
 <file path=word/numbering.xml><?xml version="1.0" encoding="utf-8"?>
 <w:numbering xmlns:wpc="http://schemas.microsoft.com/office/word/2010/wordprocessingCanvas" xmlns:cx="http://schemas.microsoft.com/office/drawing/2014/chartex" xmlns:cx1="http://schemas.microsoft.com/office/drawing/2015/9/8/chartex" xmlns:cx2="http://schemas.microsoft.com/office/drawing/2015/10/21/chartex" xmlns:cx3="http://schemas.microsoft.com/office/drawing/2016/5/9/chartex" xmlns:cx4="http://schemas.microsoft.com/office/drawing/2016/5/10/chartex" xmlns:cx5="http://schemas.microsoft.com/office/drawing/2016/5/11/chartex" xmlns:cx6="http://schemas.microsoft.com/office/drawing/2016/5/12/chartex" xmlns:cx7="http://schemas.microsoft.com/office/drawing/2016/5/13/chartex" xmlns:cx8="http://schemas.microsoft.com/office/drawing/2016/5/14/chartex" xmlns:mc="http://schemas.openxmlformats.org/markup-compatibility/2006" xmlns:aink="http://schemas.microsoft.com/office/drawing/2016/ink" xmlns:am3d="http://schemas.microsoft.com/office/drawing/2017/model3d" xmlns:o="urn:schemas-microsoft-com:office:office" xmlns:oel="http://schemas.microsoft.com/office/2019/extlst" xmlns:r="http://schemas.openxmlformats.org/officeDocument/2006/relationships" xmlns:m="http://schemas.openxmlformats.org/officeDocument/2006/math" xmlns:v="urn:schemas-microsoft-com:vml" xmlns:wp14="http://schemas.microsoft.com/office/word/2010/wordprocessingDrawing" xmlns:wp="http://schemas.openxmlformats.org/drawingml/2006/wordprocessingDrawing" xmlns:w10="urn:schemas-microsoft-com:office:word" xmlns:w="http://schemas.openxmlformats.org/wordprocessingml/2006/main" xmlns:w14="http://schemas.microsoft.com/office/word/2010/wordml" xmlns:w15="http://schemas.microsoft.com/office/word/2012/wordml" xmlns:w16cex="http://schemas.microsoft.com/office/word/2018/wordml/cex" xmlns:w16cid="http://schemas.microsoft.com/office/word/2016/wordml/cid" xmlns:w16="http://schemas.microsoft.com/office/word/2018/wordml" xmlns:w16du="http://schemas.microsoft.com/office/word/2023/wordml/word16du" xmlns:w16sdtdh="http://schemas.microsoft.com/office/word/2020/wordml/sdtdatahash" xmlns:w16sdtfl="http://schemas.microsoft.com/office/word/2024/wordml/sdtformatlock" xmlns:w16se="http://schemas.microsoft.com/office/word/2015/wordml/symex" xmlns:wpg="http://schemas.microsoft.com/office/word/2010/wordprocessingGroup" xmlns:wpi="http://schemas.microsoft.com/office/word/2010/wordprocessingInk" xmlns:wne="http://schemas.microsoft.com/office/word/2006/wordml" xmlns:wps="http://schemas.microsoft.com/office/word/2010/wordprocessingShape" mc:Ignorable="w14 w15 w16se w16cid w16 w16cex w16sdtdh w16sdtfl w16du wp14">
   <w:abstractNum w:abstractNumId="0" w15:restartNumberingAfterBreak="0">
-    <w:nsid w:val="516B33CB"/>
+    <w:nsid w:val="69AF349C"/>
     <w:multiLevelType w:val="singleLevel"/>
     <w:tmpl w:val="580A000F"/>
     <w:lvl w:ilvl="0">
@@ -886,7 +886,7 @@
       </w:pPr>
     </w:lvl>
   </w:abstractNum>
-  <w:num w:numId="1" w16cid:durableId="301430243">
+  <w:num w:numId="1" w16cid:durableId="535385112">
     <w:abstractNumId w:val="0"/>
   </w:num>
 </w:numbering>
@@ -1300,7 +1300,7 @@
     <w:link w:val="Ttulo1Car"/>
     <w:uiPriority w:val="9"/>
     <w:qFormat/>
-    <w:rsid w:val="00E436AB"/>
+    <w:rsid w:val="00CC5EAA"/>
     <w:pPr>
       <w:keepNext/>
       <w:keepLines/>
@@ -1323,7 +1323,7 @@
     <w:semiHidden/>
     <w:unhideWhenUsed/>
     <w:qFormat/>
-    <w:rsid w:val="00E436AB"/>
+    <w:rsid w:val="00CC5EAA"/>
     <w:pPr>
       <w:keepNext/>
       <w:keepLines/>
@@ -1346,7 +1346,7 @@
     <w:semiHidden/>
     <w:unhideWhenUsed/>
     <w:qFormat/>
-    <w:rsid w:val="00E436AB"/>
+    <w:rsid w:val="00CC5EAA"/>
     <w:pPr>
       <w:keepNext/>
       <w:keepLines/>
@@ -1369,7 +1369,7 @@
     <w:semiHidden/>
     <w:unhideWhenUsed/>
     <w:qFormat/>
-    <w:rsid w:val="00E436AB"/>
+    <w:rsid w:val="00CC5EAA"/>
     <w:pPr>
       <w:keepNext/>
       <w:keepLines/>
@@ -1392,7 +1392,7 @@
     <w:semiHidden/>
     <w:unhideWhenUsed/>
     <w:qFormat/>
-    <w:rsid w:val="00E436AB"/>
+    <w:rsid w:val="00CC5EAA"/>
     <w:pPr>
       <w:keepNext/>
       <w:keepLines/>
@@ -1413,7 +1413,7 @@
     <w:semiHidden/>
     <w:unhideWhenUsed/>
     <w:qFormat/>
-    <w:rsid w:val="00E436AB"/>
+    <w:rsid w:val="00CC5EAA"/>
     <w:pPr>
       <w:keepNext/>
       <w:keepLines/>
@@ -1436,7 +1436,7 @@
     <w:semiHidden/>
     <w:unhideWhenUsed/>
     <w:qFormat/>
-    <w:rsid w:val="00E436AB"/>
+    <w:rsid w:val="00CC5EAA"/>
     <w:pPr>
       <w:keepNext/>
       <w:keepLines/>
@@ -1457,7 +1457,7 @@
     <w:semiHidden/>
     <w:unhideWhenUsed/>
     <w:qFormat/>
-    <w:rsid w:val="00E436AB"/>
+    <w:rsid w:val="00CC5EAA"/>
     <w:pPr>
       <w:keepNext/>
       <w:keepLines/>
@@ -1480,7 +1480,7 @@
     <w:semiHidden/>
     <w:unhideWhenUsed/>
     <w:qFormat/>
-    <w:rsid w:val="00E436AB"/>
+    <w:rsid w:val="00CC5EAA"/>
     <w:pPr>
       <w:keepNext/>
       <w:keepLines/>
@@ -1524,7 +1524,7 @@
     <w:basedOn w:val="Fuentedeprrafopredeter"/>
     <w:link w:val="Ttulo1"/>
     <w:uiPriority w:val="9"/>
-    <w:rsid w:val="00E436AB"/>
+    <w:rsid w:val="00CC5EAA"/>
     <w:rPr>
       <w:rFonts w:asciiTheme="majorHAnsi" w:eastAsiaTheme="majorEastAsia" w:hAnsiTheme="majorHAnsi" w:cstheme="majorBidi"/>
       <w:color w:val="0F4761" w:themeColor="accent1" w:themeShade="BF"/>
@@ -1538,7 +1538,7 @@
     <w:link w:val="Ttulo2"/>
     <w:uiPriority w:val="9"/>
     <w:semiHidden/>
-    <w:rsid w:val="00E436AB"/>
+    <w:rsid w:val="00CC5EAA"/>
     <w:rPr>
       <w:rFonts w:asciiTheme="majorHAnsi" w:eastAsiaTheme="majorEastAsia" w:hAnsiTheme="majorHAnsi" w:cstheme="majorBidi"/>
       <w:color w:val="0F4761" w:themeColor="accent1" w:themeShade="BF"/>
@@ -1552,7 +1552,7 @@
     <w:link w:val="Ttulo3"/>
     <w:uiPriority w:val="9"/>
     <w:semiHidden/>
-    <w:rsid w:val="00E436AB"/>
+    <w:rsid w:val="00CC5EAA"/>
     <w:rPr>
       <w:rFonts w:eastAsiaTheme="majorEastAsia" w:cstheme="majorBidi"/>
       <w:color w:val="0F4761" w:themeColor="accent1" w:themeShade="BF"/>
@@ -1566,7 +1566,7 @@
     <w:link w:val="Ttulo4"/>
     <w:uiPriority w:val="9"/>
     <w:semiHidden/>
-    <w:rsid w:val="00E436AB"/>
+    <w:rsid w:val="00CC5EAA"/>
     <w:rPr>
       <w:rFonts w:eastAsiaTheme="majorEastAsia" w:cstheme="majorBidi"/>
       <w:i/>
@@ -1580,7 +1580,7 @@
     <w:link w:val="Ttulo5"/>
     <w:uiPriority w:val="9"/>
     <w:semiHidden/>
-    <w:rsid w:val="00E436AB"/>
+    <w:rsid w:val="00CC5EAA"/>
     <w:rPr>
       <w:rFonts w:eastAsiaTheme="majorEastAsia" w:cstheme="majorBidi"/>
       <w:color w:val="0F4761" w:themeColor="accent1" w:themeShade="BF"/>
@@ -1592,7 +1592,7 @@
     <w:link w:val="Ttulo6"/>
     <w:uiPriority w:val="9"/>
     <w:semiHidden/>
-    <w:rsid w:val="00E436AB"/>
+    <w:rsid w:val="00CC5EAA"/>
     <w:rPr>
       <w:rFonts w:eastAsiaTheme="majorEastAsia" w:cstheme="majorBidi"/>
       <w:i/>
@@ -1606,7 +1606,7 @@
     <w:link w:val="Ttulo7"/>
     <w:uiPriority w:val="9"/>
     <w:semiHidden/>
-    <w:rsid w:val="00E436AB"/>
+    <w:rsid w:val="00CC5EAA"/>
     <w:rPr>
       <w:rFonts w:eastAsiaTheme="majorEastAsia" w:cstheme="majorBidi"/>
       <w:color w:val="595959" w:themeColor="text1" w:themeTint="A6"/>
@@ -1618,7 +1618,7 @@
     <w:link w:val="Ttulo8"/>
     <w:uiPriority w:val="9"/>
     <w:semiHidden/>
-    <w:rsid w:val="00E436AB"/>
+    <w:rsid w:val="00CC5EAA"/>
     <w:rPr>
       <w:rFonts w:eastAsiaTheme="majorEastAsia" w:cstheme="majorBidi"/>
       <w:i/>
@@ -1632,7 +1632,7 @@
     <w:link w:val="Ttulo9"/>
     <w:uiPriority w:val="9"/>
     <w:semiHidden/>
-    <w:rsid w:val="00E436AB"/>
+    <w:rsid w:val="00CC5EAA"/>
     <w:rPr>
       <w:rFonts w:eastAsiaTheme="majorEastAsia" w:cstheme="majorBidi"/>
       <w:color w:val="272727" w:themeColor="text1" w:themeTint="D8"/>
@@ -1645,7 +1645,7 @@
     <w:link w:val="TtuloCar"/>
     <w:uiPriority w:val="10"/>
     <w:qFormat/>
-    <w:rsid w:val="00E436AB"/>
+    <w:rsid w:val="00CC5EAA"/>
     <w:pPr>
       <w:spacing w:after="80" w:line="240" w:lineRule="auto"/>
       <w:contextualSpacing/>
@@ -1663,7 +1663,7 @@
     <w:basedOn w:val="Fuentedeprrafopredeter"/>
     <w:link w:val="Ttulo"/>
     <w:uiPriority w:val="10"/>
-    <w:rsid w:val="00E436AB"/>
+    <w:rsid w:val="00CC5EAA"/>
     <w:rPr>
       <w:rFonts w:asciiTheme="majorHAnsi" w:eastAsiaTheme="majorEastAsia" w:hAnsiTheme="majorHAnsi" w:cstheme="majorBidi"/>
       <w:spacing w:val="-10"/>
@@ -1679,7 +1679,7 @@
     <w:link w:val="SubttuloCar"/>
     <w:uiPriority w:val="11"/>
     <w:qFormat/>
-    <w:rsid w:val="00E436AB"/>
+    <w:rsid w:val="00CC5EAA"/>
     <w:pPr>
       <w:numPr>
         <w:ilvl w:val="1"/>
@@ -1698,7 +1698,7 @@
     <w:basedOn w:val="Fuentedeprrafopredeter"/>
     <w:link w:val="Subttulo"/>
     <w:uiPriority w:val="11"/>
-    <w:rsid w:val="00E436AB"/>
+    <w:rsid w:val="00CC5EAA"/>
     <w:rPr>
       <w:rFonts w:eastAsiaTheme="majorEastAsia" w:cstheme="majorBidi"/>
       <w:color w:val="595959" w:themeColor="text1" w:themeTint="A6"/>
@@ -1714,7 +1714,7 @@
     <w:link w:val="CitaCar"/>
     <w:uiPriority w:val="29"/>
     <w:qFormat/>
-    <w:rsid w:val="00E436AB"/>
+    <w:rsid w:val="00CC5EAA"/>
     <w:pPr>
       <w:spacing w:before="160"/>
       <w:jc w:val="center"/>
@@ -1730,7 +1730,7 @@
     <w:basedOn w:val="Fuentedeprrafopredeter"/>
     <w:link w:val="Cita"/>
     <w:uiPriority w:val="29"/>
-    <w:rsid w:val="00E436AB"/>
+    <w:rsid w:val="00CC5EAA"/>
     <w:rPr>
       <w:i/>
       <w:iCs/>
@@ -1742,7 +1742,7 @@
     <w:basedOn w:val="Normal"/>
     <w:uiPriority w:val="34"/>
     <w:qFormat/>
-    <w:rsid w:val="00E436AB"/>
+    <w:rsid w:val="00CC5EAA"/>
     <w:pPr>
       <w:ind w:left="720"/>
       <w:contextualSpacing/>
@@ -1753,7 +1753,7 @@
     <w:basedOn w:val="Fuentedeprrafopredeter"/>
     <w:uiPriority w:val="21"/>
     <w:qFormat/>
-    <w:rsid w:val="00E436AB"/>
+    <w:rsid w:val="00CC5EAA"/>
     <w:rPr>
       <w:i/>
       <w:iCs/>
@@ -1767,7 +1767,7 @@
     <w:link w:val="CitadestacadaCar"/>
     <w:uiPriority w:val="30"/>
     <w:qFormat/>
-    <w:rsid w:val="00E436AB"/>
+    <w:rsid w:val="00CC5EAA"/>
     <w:pPr>
       <w:pBdr>
         <w:top w:val="single" w:sz="4" w:space="10" w:color="0F4761" w:themeColor="accent1" w:themeShade="BF"/>
@@ -1788,7 +1788,7 @@
     <w:basedOn w:val="Fuentedeprrafopredeter"/>
     <w:link w:val="Citadestacada"/>
     <w:uiPriority w:val="30"/>
-    <w:rsid w:val="00E436AB"/>
+    <w:rsid w:val="00CC5EAA"/>
     <w:rPr>
       <w:i/>
       <w:iCs/>
@@ -1800,7 +1800,7 @@
     <w:basedOn w:val="Fuentedeprrafopredeter"/>
     <w:uiPriority w:val="32"/>
     <w:qFormat/>
-    <w:rsid w:val="00E436AB"/>
+    <w:rsid w:val="00CC5EAA"/>
     <w:rPr>
       <w:b/>
       <w:bCs/>

</xml_diff>